<commit_message>
docs: add a PDF of the worksheet and drop the blank lines under the last reflection
The PDF opens directly on GitHub; the .docx stays next to it for download.

Co-Authored-By: Claude Opus 5.5 <noreply@anthropic.com>
Claude-Session: https://claude.ai/code/session_01GESoAsY3MXi1qxwZNdZBJa
</commit_message>
<xml_diff>
--- a/docs/GitHub-Codex-作業單.docx
+++ b/docs/GitHub-Codex-作業單.docx
@@ -6806,36 +6806,6 @@
         <w:t>4. 自評約 60%：原作品只能在一台裝置輪流玩，現在多了每人一台手機的多人連線模式（含選企業大廳、斷線處理、只看自己資料的排行），加上組員做的企業投資與商機競標；原本的遊戲規則沒有改。程式量從約 150 KB 增加到約 240 KB，測試從 21 個增加到 51 個。</w:t>
       </w:r>
     </w:p>
-    <w:p>
-      <w:r>
-        <w:pict w14:anchorId="5FC5E842">
-          <v:rect id="Horizontal Line 2" o:spid="_x0000_s1028" style="width:473.4pt;height:.05pt;visibility:visible;mso-wrap-style:square;mso-left-percent:-10001;mso-top-percent:-10001;mso-position-horizontal:absolute;mso-position-horizontal-relative:char;mso-position-vertical:absolute;mso-position-vertical-relative:line;mso-left-percent:-10001;mso-top-percent:-10001;v-text-anchor:top" filled="f">
-            <o:lock v:ext="edit" rotation="t" aspectratio="t" verticies="t" text="t" shapetype="t"/>
-            <w10:anchorlock/>
-          </v:rect>
-        </w:pict>
-      </w:r>
-    </w:p>
-    <w:p>
-      <w:r>
-        <w:pict w14:anchorId="20884A63">
-          <v:rect id="Horizontal Line 3" o:spid="_x0000_s1027" style="width:473.4pt;height:.05pt;visibility:visible;mso-wrap-style:square;mso-left-percent:-10001;mso-top-percent:-10001;mso-position-horizontal:absolute;mso-position-horizontal-relative:char;mso-position-vertical:absolute;mso-position-vertical-relative:line;mso-left-percent:-10001;mso-top-percent:-10001;v-text-anchor:top" filled="f">
-            <o:lock v:ext="edit" rotation="t" aspectratio="t" verticies="t" text="t" shapetype="t"/>
-            <w10:anchorlock/>
-          </v:rect>
-        </w:pict>
-      </w:r>
-    </w:p>
-    <w:p>
-      <w:r>
-        <w:pict w14:anchorId="281AE763">
-          <v:rect id="Horizontal Line 4" o:spid="_x0000_s1026" style="width:473.4pt;height:.05pt;visibility:visible;mso-wrap-style:square;mso-left-percent:-10001;mso-top-percent:-10001;mso-position-horizontal:absolute;mso-position-horizontal-relative:char;mso-position-vertical:absolute;mso-position-vertical-relative:line;mso-left-percent:-10001;mso-top-percent:-10001;v-text-anchor:top" filled="f">
-            <o:lock v:ext="edit" rotation="t" aspectratio="t" verticies="t" text="t" shapetype="t"/>
-            <w10:anchorlock/>
-          </v:rect>
-        </w:pict>
-      </w:r>
-    </w:p>
     <w:bookmarkEnd w:id="21"/>
     <w:bookmarkEnd w:id="24"/>
     <w:p>

</xml_diff>

<commit_message>
docs: update the worksheet for the party version, the room QR code and the leave fix
改良 A is now joining by QR code and 改良 B is keeping the lobby from freezing
when someone leaves; the evidence screenshots, test output, before/after run,
commit list, Task 8 table, Task 10 estimate and reflections describe the
version that is live now.

Co-Authored-By: Claude Opus 5.5 <noreply@anthropic.com>
Claude-Session: https://claude.ai/code/session_01GESoAsY3MXi1qxwZNdZBJa
</commit_message>
<xml_diff>
--- a/docs/GitHub-Codex-作業單.docx
+++ b/docs/GitHub-Codex-作業單.docx
@@ -4217,7 +4217,7 @@
       <w:r>
         <w:drawing>
           <wp:inline xmlns:a="http://schemas.openxmlformats.org/drawingml/2006/main" xmlns:pic="http://schemas.openxmlformats.org/drawingml/2006/picture">
-            <wp:extent cx="5852160" cy="1391381"/>
+            <wp:extent cx="5852160" cy="1504841"/>
             <wp:docPr id="1135014468" name="Picture 1135014468"/>
             <wp:cNvGraphicFramePr>
               <a:graphicFrameLocks noChangeAspect="1"/>
@@ -4238,7 +4238,7 @@
                   <pic:spPr>
                     <a:xfrm>
                       <a:off x="0" y="0"/>
-                      <a:ext cx="5852160" cy="1391381"/>
+                      <a:ext cx="5852160" cy="1504841"/>
                     </a:xfrm>
                     <a:prstGeom prst="rect"/>
                   </pic:spPr>
@@ -4255,7 +4255,7 @@
           <w:color w:val="556066"/>
           <w:sz w:val="18"/>
         </w:rPr>
-        <w:t>GitHub 上的分支：main（原作品，留給 PR 比較用）、feature/my-improvement（本次改良，GitHub Pages 從這裡部署）。另外有組員開發投資與競標用的 feature/investment-auction 和合併前的備份分支，以及 AI 工具工作用的 claude/room-connection-timeout-l24xbb。</w:t>
+        <w:t>GitHub 上的分支：main（原作品，留給 PR 比較用）、feature/my-improvement（目前的成果，GitHub Pages 從這裡部署）。另外有組員開發投資與競標用的 feature/investment-auction、組員兩次大改版前留下的備份分支（backup/pre-investment-auction-20261022、backup/pre-party-20261028），以及 AI 工具工作用的 claude/room-connection-timeout-l24xbb。</w:t>
       </w:r>
     </w:p>
     <w:p>
@@ -4546,7 +4546,7 @@
               <w:rPr>
                 <w:sz w:val="18"/>
               </w:rPr>
-              <w:t>原作品只能在同一台電腦輪流玩，大家要擠在同一個螢幕前，不能用自己的手機操作自己的公司。</w:t>
+              <w:t>組員改版成「併購派對」後，多人連線的房間代碼是 PeerJS 自動產生的 36 個字（例如 e2b30ad3-7989-4dac-a7cc-53564820ef59），用手機很難輸入，加入房間很麻煩。</w:t>
             </w:r>
           </w:p>
         </w:tc>
@@ -4587,7 +4587,7 @@
               <w:rPr>
                 <w:sz w:val="18"/>
               </w:rPr>
-              <w:t>首頁分成「一台裝置輪流玩」和「多人連線」兩種模式，多人連線不會動到單機存檔。多人連線：房主建立 5 碼房間代碼或邀請連結，其他人用自己的手機加入同一局。進房後每個人自己輸入名字、選一家企業（別人選走的不能選），房主隨時可以開始；開始後每台裝置就對應自己選的企業並鎖定，輪到誰就只有那台能操作。連線用 WebRTC 點對點（PeerJS），不用另外架伺服器，可直接放在 GitHub Pages。</w:t>
+              <w:t>房主的大廳顯示房間 QR Code，其他人用手機相機掃描就打開遊戲，自動跳出「加入房間」並填好代碼，只要輸入名字。QR Code 只在線上網址顯示；QR Code 產生器載入失敗時，大廳仍照常顯示代碼。</w:t>
             </w:r>
           </w:p>
         </w:tc>
@@ -4632,7 +4632,7 @@
               <w:rPr>
                 <w:sz w:val="18"/>
               </w:rPr>
-              <w:t>連線失敗時，訪客畫面一直停在「正在連線…」，沒有任何提示；房主手機鎖螢幕後，房間可能被拆掉或換代碼；玩家區一次列出所有人的完整資料太擁擠，也看不出哪位是自己。</w:t>
+              <w:t>實際用手機測試時，有人退出房間後，房主大廳一直顯示「連線中…」不會消失；同一個人回來會出現兩個同名玩家，房主按開始後建立棋盤失敗，所有裝置都卡住。直接關掉頁面或鎖螢幕的人，房主完全不知道。</w:t>
             </w:r>
           </w:p>
         </w:tc>
@@ -4673,7 +4673,7 @@
               <w:rPr>
                 <w:sz w:val="18"/>
               </w:rPr>
-              <w:t>連不上時最多約 15 秒就顯示原因，並建議改用手機熱點；房主暫時離線時保留房間和代碼，回來後自動恢復；找不到房間時說明可能原因；玩家區只顯示自己的完整資料並標「你」，其他人改看「淨資產排行」（名次、公司、淨資產）。</w:t>
+              <w:t>開始前離開的人馬上從大廳移除；手機鎖螢幕或關掉頁面約 12 秒後標成「已離線」，回來自動恢復，開始時已離線的人不加入，回來時告訴他原因；名字重複自動加編號、季數限制 3–30、房間最多 8 人；開不了局時大家回到大廳並看到原因；和房主斷線時回到加入畫面並填好代碼和名字。</w:t>
             </w:r>
           </w:p>
         </w:tc>
@@ -4714,7 +4714,7 @@
               <w:rPr>
                 <w:sz w:val="18"/>
               </w:rPr>
-              <w:t>① node --test 單元測試 34 個；② 用 Playwright 在 Chromium 實際連線（真的 PeerJS＋本機配對伺服器），測試選企業大廳、座位鎖定、連線逾時、斷線恢復等情境；③ 兩支手機在不同網路實機連線遊玩；④ 用手機寬度 375px 檢查版面沒有跑掉。</w:t>
+              <w:t>① node --test：net.test.js 18 個連線測試（新增 14 個）；② 用 Playwright 在 Chromium 開多個瀏覽器，以真的 PeerJS 和本機配對伺服器實際連線：用 QR 解碼器掃畫面上的 QR Code 再加入（14 項）、有人離開或斷線（16 項，修改前只過 1 項）、房間裡輪流擲骰（6 項）；③ 390px 手機寬度檢查版面；④ 上課時用兩支以上的手機實際掃描、退出再加入。</w:t>
             </w:r>
           </w:p>
         </w:tc>
@@ -4762,7 +4762,7 @@
         <w:t>選擇方案的原因：</w:t>
       </w:r>
       <w:r>
-        <w:t>原作品只能大家擠在同一台電腦輪流玩，但上課時每個人都有手機，所以改良 A 選「多人連線」，讓每個人用自己的手機加入同一局。實際用手機測試時，發現連不上時畫面會一直停在「正在連線…」、玩家資料太擠也看不出哪個是自己，所以改良 B 選連線錯誤處理和畫面精簡。（Codex 提供的候選方案請本人從 Codex 補上截圖。）</w:t>
+        <w:t>組員把遊戲改版成「併購派對」後，多人連線改用 PeerJS 自動產生的 ID 當房間代碼，是一長串 36 個字，用手機很難輸入，所以改良 A 選「掃 QR Code 加入房間」。實際用手機測試時，有人退出房間後，房主大廳一直顯示「連線中…」，房主按開始後所有人的畫面都卡住，所以改良 B 選「有人離開或斷線時不會卡住」。（Codex 提供的候選方案請本人從 Codex 補上截圖。）</w:t>
       </w:r>
     </w:p>
     <w:p>
@@ -4846,7 +4846,7 @@
         <w:rPr>
           <w:lang w:eastAsia="zh-TW"/>
         </w:rPr>
-        <w:t>我選擇的改良 A 是：「新增「多人連線」：房主建立 5 碼房間代碼和邀請連結，其他人用自己的手機加入同一局；進房後每個人輸入名字、選一家企業（同一家只能一個人選），房主隨時可以開始，開始後每台裝置只能操作自己的企業」。請先確認要修改的檔案，保留原有功能，再實作這一項改良。完成後請說明改動了哪些檔案、如何操作新功能，以及應做哪些測試。不要同時實作改良 B，也不要 Commit 或 Push。</w:t>
+        <w:t>我選擇的改良 A 是：「在多人連線的大廳加上房間 QR Code：內容是遊戲網址加上房間代碼，其他人用手機相機掃描後直接打開遊戲、跳出「加入房間」並填好代碼，只要輸入名字就能加入；用本機網址開啟時別的裝置打不開，不顯示 QR Code」。請先確認要修改的檔案，保留原有功能，再實作這一項改良。完成後請說明改動了哪些檔案、如何操作新功能，以及應做哪些測試。不要同時實作改良 B，也不要 Commit 或 Push。</w:t>
       </w:r>
     </w:p>
     <w:p>
@@ -4882,7 +4882,7 @@
         <w:rPr>
           <w:lang w:eastAsia="zh-TW"/>
         </w:rPr>
-        <w:t>改良 A 已完成。請在不破壞現有功能的前提下完成改良 B：「改善多人連線的穩定性和畫面：連不上時 15 秒內顯示原因並建議改用手機熱點；房主暫時斷線時保留房間和代碼並自動重連；玩家區只顯示自己的完整資料，其他人改用淨資產排行」。請保留清楚的 UI 文字、錯誤處理或響應式設計；完成後列出變更清單、潛在副作用與驗證步驟。不要自行 Commit 或 Push。</w:t>
+        <w:t>改良 A 已完成。請在不破壞現有功能的前提下完成改良 B：「修正有人離開房間後大廳卡住的問題：開始前離開的人要馬上從大廳移除；手機鎖螢幕或關掉頁面的人要標成「已離線」，開始時不加入；名字重複、季數超出範圍或人數太多時不能讓所有裝置卡住，開不了局時要回到大廳並顯示原因」。請保留清楚的 UI 文字、錯誤處理或響應式設計；完成後列出變更清單、潛在副作用與驗證步驟。不要自行 Commit 或 Push。</w:t>
       </w:r>
     </w:p>
     <w:p>
@@ -4963,7 +4963,7 @@
           <w:b/>
           <w:sz w:val="21"/>
         </w:rPr>
-        <w:t>改良 A：多人連線</w:t>
+        <w:t>改良 A：掃 QR Code 加入房間</w:t>
       </w:r>
     </w:p>
     <w:p>
@@ -4979,7 +4979,7 @@
               <a:graphicData uri="http://schemas.openxmlformats.org/drawingml/2006/picture">
                 <pic:pic>
                   <pic:nvPicPr>
-                    <pic:cNvPr id="0" name="ev7a-home.png"/>
+                    <pic:cNvPr id="0" name="ev7a-qr-host.png"/>
                     <pic:cNvPicPr/>
                   </pic:nvPicPr>
                   <pic:blipFill>
@@ -5016,7 +5016,7 @@
               <a:graphicData uri="http://schemas.openxmlformats.org/drawingml/2006/picture">
                 <pic:pic>
                   <pic:nvPicPr>
-                    <pic:cNvPr id="0" name="ev7a-host-lobby.png"/>
+                    <pic:cNvPr id="0" name="ev7a-qr-join.png"/>
                     <pic:cNvPicPr/>
                   </pic:nvPicPr>
                   <pic:blipFill>
@@ -5053,7 +5053,7 @@
               <a:graphicData uri="http://schemas.openxmlformats.org/drawingml/2006/picture">
                 <pic:pic>
                   <pic:nvPicPr>
-                    <pic:cNvPr id="0" name="ev7a-guest-lobby.png"/>
+                    <pic:cNvPr id="0" name="ev7a-qr-guest-lobby.png"/>
                     <pic:cNvPicPr/>
                   </pic:nvPicPr>
                   <pic:blipFill>
@@ -5082,14 +5082,26 @@
           <w:color w:val="556066"/>
           <w:sz w:val="18"/>
         </w:rPr>
-        <w:t>左：首頁分成「一台裝置輪流玩」和「多人連線」兩個入口。中：房主建立房間，拿到房間代碼，輸入名字並選企業。右：另一台裝置用代碼加入，別人選走的企業會變灰。</w:t>
+        <w:t>左：房主建立房間後，大廳在房間代碼下方顯示 QR Code（內容是 https://soymilk0211.github.io/bigdata-week7/?room=房間代碼）。中：其他人用手機相機掃描，打開遊戲就跳出「加入房間」，代碼已經填好，只要輸入名字。右：按「加入房間」後進入同一個大廳，自己選企業。用 localhost、127.0.0.1 或 file:// 開啟時別的裝置打不開，改成顯示說明文字。</w:t>
+      </w:r>
+    </w:p>
+    <w:p>
+      <w:pPr>
+        <w:keepNext/>
+      </w:pPr>
+      <w:r>
+        <w:rPr>
+          <w:b/>
+          <w:sz w:val="21"/>
+        </w:rPr>
+        <w:t>改良 B：有人離開或斷線時不會卡住</w:t>
       </w:r>
     </w:p>
     <w:p>
       <w:r>
         <w:drawing>
           <wp:inline xmlns:a="http://schemas.openxmlformats.org/drawingml/2006/main" xmlns:pic="http://schemas.openxmlformats.org/drawingml/2006/picture">
-            <wp:extent cx="1737360" cy="3759825"/>
+            <wp:extent cx="1554480" cy="3364054"/>
             <wp:docPr id="1135014472" name="Picture 1135014472"/>
             <wp:cNvGraphicFramePr>
               <a:graphicFrameLocks noChangeAspect="1"/>
@@ -5098,7 +5110,7 @@
               <a:graphicData uri="http://schemas.openxmlformats.org/drawingml/2006/picture">
                 <pic:pic>
                   <pic:nvPicPr>
-                    <pic:cNvPr id="0" name="ev7a-guest-game.png"/>
+                    <pic:cNvPr id="0" name="ev7b-before.png"/>
                     <pic:cNvPicPr/>
                   </pic:nvPicPr>
                   <pic:blipFill>
@@ -5110,7 +5122,7 @@
                   <pic:spPr>
                     <a:xfrm>
                       <a:off x="0" y="0"/>
-                      <a:ext cx="1737360" cy="3759825"/>
+                      <a:ext cx="1554480" cy="3364054"/>
                     </a:xfrm>
                     <a:prstGeom prst="rect"/>
                   </pic:spPr>
@@ -5126,7 +5138,7 @@
       <w:r>
         <w:drawing>
           <wp:inline xmlns:a="http://schemas.openxmlformats.org/drawingml/2006/main" xmlns:pic="http://schemas.openxmlformats.org/drawingml/2006/picture">
-            <wp:extent cx="1737360" cy="3421337"/>
+            <wp:extent cx="1554480" cy="3364054"/>
             <wp:docPr id="1135014473" name="Picture 1135014473"/>
             <wp:cNvGraphicFramePr>
               <a:graphicFrameLocks noChangeAspect="1"/>
@@ -5135,7 +5147,7 @@
               <a:graphicData uri="http://schemas.openxmlformats.org/drawingml/2006/picture">
                 <pic:pic>
                   <pic:nvPicPr>
-                    <pic:cNvPr id="0" name="ev7a-guest-ranking.png"/>
+                    <pic:cNvPr id="0" name="ev7b-after.png"/>
                     <pic:cNvPicPr/>
                   </pic:nvPicPr>
                   <pic:blipFill>
@@ -5147,7 +5159,7 @@
                   <pic:spPr>
                     <a:xfrm>
                       <a:off x="0" y="0"/>
-                      <a:ext cx="1737360" cy="3421337"/>
+                      <a:ext cx="1554480" cy="3364054"/>
                     </a:xfrm>
                     <a:prstGeom prst="rect"/>
                   </pic:spPr>
@@ -5157,33 +5169,13 @@
           </wp:inline>
         </w:drawing>
       </w:r>
-    </w:p>
-    <w:p>
-      <w:r>
-        <w:rPr>
-          <w:color w:val="556066"/>
-          <w:sz w:val="18"/>
-        </w:rPr>
-        <w:t>房主按「開始遊戲」後，每台裝置自動對應自己選的企業（上方顯示「你：小明」）。玩家區只顯示自己的完整資料，其他人只出現在「淨資產排行」。</w:t>
-      </w:r>
-    </w:p>
-    <w:p>
-      <w:pPr>
-        <w:keepNext/>
-      </w:pPr>
-      <w:r>
-        <w:rPr>
-          <w:b/>
-          <w:sz w:val="21"/>
-        </w:rPr>
-        <w:t>改良 B：連線錯誤處理與畫面精簡</w:t>
-      </w:r>
-    </w:p>
-    <w:p>
+      <w:r>
+        <w:t xml:space="preserve">  </w:t>
+      </w:r>
       <w:r>
         <w:drawing>
           <wp:inline xmlns:a="http://schemas.openxmlformats.org/drawingml/2006/main" xmlns:pic="http://schemas.openxmlformats.org/drawingml/2006/picture">
-            <wp:extent cx="1737360" cy="3759825"/>
+            <wp:extent cx="1554480" cy="3364054"/>
             <wp:docPr id="1135014474" name="Picture 1135014474"/>
             <wp:cNvGraphicFramePr>
               <a:graphicFrameLocks noChangeAspect="1"/>
@@ -5192,7 +5184,7 @@
               <a:graphicData uri="http://schemas.openxmlformats.org/drawingml/2006/picture">
                 <pic:pic>
                   <pic:nvPicPr>
-                    <pic:cNvPr id="0" name="ev7b-p2p-failed.png"/>
+                    <pic:cNvPr id="0" name="ev7b-rejoin.png"/>
                     <pic:cNvPicPr/>
                   </pic:nvPicPr>
                   <pic:blipFill>
@@ -5204,7 +5196,7 @@
                   <pic:spPr>
                     <a:xfrm>
                       <a:off x="0" y="0"/>
-                      <a:ext cx="1737360" cy="3759825"/>
+                      <a:ext cx="1554480" cy="3364054"/>
                     </a:xfrm>
                     <a:prstGeom prst="rect"/>
                   </pic:spPr>
@@ -5214,13 +5206,33 @@
           </wp:inline>
         </w:drawing>
       </w:r>
-      <w:r>
-        <w:t xml:space="preserve">  </w:t>
-      </w:r>
+    </w:p>
+    <w:p>
+      <w:r>
+        <w:rPr>
+          <w:color w:val="556066"/>
+          <w:sz w:val="18"/>
+        </w:rPr>
+        <w:t>左（修改前）：小明按 × 離開後，房主大廳還留著「小明 · 連線中…」，他重新加入後出現兩個「小明」，房主按開始時建立棋盤失敗，所有裝置停在初始化畫面。中（修改後）：小李的手機鎖螢幕約 12 秒後被標成「已離線」（變淡），房主下方提示「開始時不會加入對局」；按 × 或關掉頁面的人會馬上移除，鎖螢幕的人回來後自動恢復在線。右（修改後）：開始前和房主斷線時，回到「加入房間」並填好代碼和名字，按一下就能重新加入。</w:t>
+      </w:r>
+    </w:p>
+    <w:p>
+      <w:pPr>
+        <w:keepNext/>
+      </w:pPr>
+      <w:r>
+        <w:rPr>
+          <w:b/>
+          <w:sz w:val="21"/>
+        </w:rPr>
+        <w:t>修改檔案清單（git diff）</w:t>
+      </w:r>
+    </w:p>
+    <w:p>
       <w:r>
         <w:drawing>
           <wp:inline xmlns:a="http://schemas.openxmlformats.org/drawingml/2006/main" xmlns:pic="http://schemas.openxmlformats.org/drawingml/2006/picture">
-            <wp:extent cx="1737360" cy="3759825"/>
+            <wp:extent cx="5852160" cy="1845222"/>
             <wp:docPr id="1135014475" name="Picture 1135014475"/>
             <wp:cNvGraphicFramePr>
               <a:graphicFrameLocks noChangeAspect="1"/>
@@ -5229,7 +5241,7 @@
               <a:graphicData uri="http://schemas.openxmlformats.org/drawingml/2006/picture">
                 <pic:pic>
                   <pic:nvPicPr>
-                    <pic:cNvPr id="0" name="ev7b-host-offline.png"/>
+                    <pic:cNvPr id="0" name="ev7-diff.png"/>
                     <pic:cNvPicPr/>
                   </pic:nvPicPr>
                   <pic:blipFill>
@@ -5241,7 +5253,7 @@
                   <pic:spPr>
                     <a:xfrm>
                       <a:off x="0" y="0"/>
-                      <a:ext cx="1737360" cy="3759825"/>
+                      <a:ext cx="5852160" cy="1845222"/>
                     </a:xfrm>
                     <a:prstGeom prst="rect"/>
                   </pic:spPr>
@@ -5258,64 +5270,7 @@
           <w:color w:val="556066"/>
           <w:sz w:val="18"/>
         </w:rPr>
-        <w:t>左：連不上房主時，15 秒內顯示原因，並建議改用同一個手機熱點（以前會一直停在「正在連線…」）。右：房主和配對伺服器暫時斷線時，房間和代碼都保留，顯示「暫時離線」並自動重連，已加入的人可以繼續玩。</w:t>
-      </w:r>
-    </w:p>
-    <w:p>
-      <w:pPr>
-        <w:keepNext/>
-      </w:pPr>
-      <w:r>
-        <w:rPr>
-          <w:b/>
-          <w:sz w:val="21"/>
-        </w:rPr>
-        <w:t>修改檔案清單（git diff）</w:t>
-      </w:r>
-    </w:p>
-    <w:p>
-      <w:r>
-        <w:drawing>
-          <wp:inline xmlns:a="http://schemas.openxmlformats.org/drawingml/2006/main" xmlns:pic="http://schemas.openxmlformats.org/drawingml/2006/picture">
-            <wp:extent cx="5852160" cy="2346836"/>
-            <wp:docPr id="1135014476" name="Picture 1135014476"/>
-            <wp:cNvGraphicFramePr>
-              <a:graphicFrameLocks noChangeAspect="1"/>
-            </wp:cNvGraphicFramePr>
-            <a:graphic>
-              <a:graphicData uri="http://schemas.openxmlformats.org/drawingml/2006/picture">
-                <pic:pic>
-                  <pic:nvPicPr>
-                    <pic:cNvPr id="0" name="ev7-diff.png"/>
-                    <pic:cNvPicPr/>
-                  </pic:nvPicPr>
-                  <pic:blipFill>
-                    <a:blip r:embed="rId28"/>
-                    <a:stretch>
-                      <a:fillRect/>
-                    </a:stretch>
-                  </pic:blipFill>
-                  <pic:spPr>
-                    <a:xfrm>
-                      <a:off x="0" y="0"/>
-                      <a:ext cx="5852160" cy="2346836"/>
-                    </a:xfrm>
-                    <a:prstGeom prst="rect"/>
-                  </pic:spPr>
-                </pic:pic>
-              </a:graphicData>
-            </a:graphic>
-          </wp:inline>
-        </w:drawing>
-      </w:r>
-    </w:p>
-    <w:p>
-      <w:r>
-        <w:rPr>
-          <w:color w:val="556066"/>
-          <w:sz w:val="18"/>
-        </w:rPr>
-        <w:t>main 與 feature/my-improvement 的差異。room.js／room.test.js 是新增的房間規則和測試，app.js 是連線和畫面；auction.js、investment.js 和它們的測試是組員 Shuoting93 加入的企業投資與商機競標。</w:t>
+        <w:t>這次兩項改良的 commit（a046cd6：QR Code；6a3abf4：有人離開不會卡住）和修改的檔案：net.js（邀請連結、離開與斷線處理、開局前檢查）、ui_party.js（大廳 QR Code、已離線標示、自動填代碼）、app.js（開局失敗回大廳、關閉頁面時通知房主）、party-ext.css、index.html（載入 QR Code 產生器、更新版本號）、README.md，以及 net.test.js 新增的 14 個測試。</w:t>
       </w:r>
     </w:p>
     <w:p>
@@ -5619,7 +5574,7 @@
               <w:rPr>
                 <w:sz w:val="18"/>
               </w:rPr>
-              <w:t>不開房間時照舊在一台電腦輪流玩：拉霸、抽卡、經營、季末結算和多頁籤同步都正常。</w:t>
+              <w:t>遊戲照常：單機（一台電腦輪流玩）和多人房間都能擲骰、移動、抽事件、用道具與技能、結算。</w:t>
             </w:r>
           </w:p>
         </w:tc>
@@ -5637,7 +5592,7 @@
               <w:rPr>
                 <w:sz w:val="18"/>
               </w:rPr>
-              <w:t>單機模式照舊顯示所有玩家卡片和「輪到你」；規則與回合的引擎測試全數通過。</w:t>
+              <w:t>房間裡房主和客機輪流擲骰、交棒都正常（瀏覽器實測 6 項）；這次只改連線和大廳，沒有動到遊戲規則。</w:t>
             </w:r>
           </w:p>
         </w:tc>
@@ -5696,7 +5651,7 @@
               <w:rPr>
                 <w:sz w:val="18"/>
               </w:rPr>
-              <w:t>不同裝置用代碼加入同一局；每個人在房間裡自己選企業，房主隨時可以開始；開始後每台只能操作自己的企業。</w:t>
+              <w:t>房主大廳顯示 QR Code；用手機掃描後打開遊戲，代碼自動填好，輸入名字就能加入；本機網址不顯示 QR Code。</w:t>
             </w:r>
           </w:p>
         </w:tc>
@@ -5714,7 +5669,7 @@
               <w:rPr>
                 <w:sz w:val="18"/>
               </w:rPr>
-              <w:t>兩支手機在不同網路實機連線遊玩成功。實測發現的問題（手機存著舊局進不了選企業畫面、按拉霸後對局消失）都已修正。瀏覽器實際連線：大廳 19、模式分開 14、座位鎖定與接手 9、完整玩一季 6 項全部通過；組員加入投資與競標後重測，多人競標與投資 20 項也通過。</w:t>
+              <w:t>用 QR 解碼器掃畫面上的 QR Code，得到正確的邀請連結；打開後自動跳出加入畫面、代碼已填好、網址的 ?room= 會清掉，可以加入並開始對局；390px 手機寬度掃得到、版面不跑掉；QR Code 產生器載入失敗時大廳仍顯示代碼。14 項全部通過。用真的手機掃描要在課堂上確認。</w:t>
             </w:r>
           </w:p>
         </w:tc>
@@ -5773,7 +5728,7 @@
               <w:rPr>
                 <w:sz w:val="18"/>
               </w:rPr>
-              <w:t>連不上時約 15 秒內顯示原因；房主離線後恢復同一個代碼；玩家區只顯示自己的資料加淨資產排行。</w:t>
+              <w:t>有人離開或斷線時大廳不會卡住，房主一定能開始；開不了局時大家回到大廳並看到原因。</w:t>
             </w:r>
           </w:p>
         </w:tc>
@@ -5791,7 +5746,7 @@
               <w:rPr>
                 <w:sz w:val="18"/>
               </w:rPr>
-              <w:t>連線逾時 8 個情境、斷線恢復 9＋3 個情境全部通過（修改前的版本分別只過 2 個）；375／1000／1500px 寬度版面正常。</w:t>
+              <w:t>修改前 16 項只過 1 項（大廳留著「連線中…」、按開始後所有裝置卡住）；修改後 16 項全過：按 × 或關頁馬上移除、鎖螢幕約 12 秒標成已離線且回來後恢復、開始時已離線的人不加入、重名自動加編號、季數 99 改成 30、房主關房或斷線時客機看到原因並能一鍵重新加入。</w:t>
             </w:r>
           </w:p>
         </w:tc>
@@ -5854,7 +5809,7 @@
               <w:rPr>
                 <w:sz w:val="18"/>
               </w:rPr>
-              <w:t>node --test 全部通過；node build.mjs 能產生 game.js。</w:t>
+              <w:t>這次新增和修改的測試全部通過，原本的測試沒有因為這次修改而變成失敗；node build.mjs 能產生 game.js。</w:t>
             </w:r>
           </w:p>
         </w:tc>
@@ -5872,7 +5827,7 @@
               <w:rPr>
                 <w:sz w:val="18"/>
               </w:rPr>
-              <w:t>51 個測試全部通過（含組員的投資、競標測試與 100 局完整模擬）；重新建置的 game.js 與提交的版本完全一致。</w:t>
+              <w:t>net.test.js 18 個全部通過；全部 83 個測試 72 個通過，另外 11 個是組員匯入時就失敗的引擎測試（修改前後都是同樣 11 個）。重新建置的 game.js 與提交的版本完全一致。</w:t>
             </w:r>
           </w:p>
         </w:tc>
@@ -5933,8 +5888,8 @@
       <w:r>
         <w:drawing>
           <wp:inline xmlns:a="http://schemas.openxmlformats.org/drawingml/2006/main" xmlns:pic="http://schemas.openxmlformats.org/drawingml/2006/picture">
-            <wp:extent cx="5852160" cy="7583922"/>
-            <wp:docPr id="1135014477" name="Picture 1135014477"/>
+            <wp:extent cx="5303520" cy="4989638"/>
+            <wp:docPr id="1135014476" name="Picture 1135014476"/>
             <wp:cNvGraphicFramePr>
               <a:graphicFrameLocks noChangeAspect="1"/>
             </wp:cNvGraphicFramePr>
@@ -5946,6 +5901,63 @@
                     <pic:cNvPicPr/>
                   </pic:nvPicPr>
                   <pic:blipFill>
+                    <a:blip r:embed="rId28"/>
+                    <a:stretch>
+                      <a:fillRect/>
+                    </a:stretch>
+                  </pic:blipFill>
+                  <pic:spPr>
+                    <a:xfrm>
+                      <a:off x="0" y="0"/>
+                      <a:ext cx="5303520" cy="4989638"/>
+                    </a:xfrm>
+                    <a:prstGeom prst="rect"/>
+                  </pic:spPr>
+                </pic:pic>
+              </a:graphicData>
+            </a:graphic>
+          </wp:inline>
+        </w:drawing>
+      </w:r>
+    </w:p>
+    <w:p>
+      <w:r>
+        <w:rPr>
+          <w:color w:val="556066"/>
+          <w:sz w:val="18"/>
+        </w:rPr>
+        <w:t>net.test.js 的 18 個連線測試全部通過（這次新增 14 個：邀請連結、離開與斷線、名字重複、季數限制、房間已滿、結算確認等）。全部 83 個測試中 72 個通過；沒通過的 11 個都在 party_engine.test.js，是組員匯入「併購派對」版時就已經失敗的（該 commit 的說明寫「58 passed, 11 failed」，修改前後都是同樣這 11 個），和這次修改無關，需要組員確認是規則改了還是測試沒跟著更新。最後一行 node build.mjs 之後 git status 沒有任何輸出，代表重新建置的 game.js 和提交的版本完全相同。</w:t>
+      </w:r>
+    </w:p>
+    <w:p>
+      <w:pPr>
+        <w:keepNext/>
+      </w:pPr>
+      <w:r>
+        <w:rPr>
+          <w:b/>
+          <w:sz w:val="21"/>
+        </w:rPr>
+        <w:t>修正前後的錯誤紀錄：</w:t>
+      </w:r>
+    </w:p>
+    <w:p>
+      <w:r>
+        <w:drawing>
+          <wp:inline xmlns:a="http://schemas.openxmlformats.org/drawingml/2006/main" xmlns:pic="http://schemas.openxmlformats.org/drawingml/2006/picture">
+            <wp:extent cx="5303520" cy="4421404"/>
+            <wp:docPr id="1135014477" name="Picture 1135014477"/>
+            <wp:cNvGraphicFramePr>
+              <a:graphicFrameLocks noChangeAspect="1"/>
+            </wp:cNvGraphicFramePr>
+            <a:graphic>
+              <a:graphicData uri="http://schemas.openxmlformats.org/drawingml/2006/picture">
+                <pic:pic>
+                  <pic:nvPicPr>
+                    <pic:cNvPr id="0" name="ev8-fix.png"/>
+                    <pic:cNvPicPr/>
+                  </pic:nvPicPr>
+                  <pic:blipFill>
                     <a:blip r:embed="rId29"/>
                     <a:stretch>
                       <a:fillRect/>
@@ -5954,7 +5966,7 @@
                   <pic:spPr>
                     <a:xfrm>
                       <a:off x="0" y="0"/>
-                      <a:ext cx="5852160" cy="7583922"/>
+                      <a:ext cx="5303520" cy="4421404"/>
                     </a:xfrm>
                     <a:prstGeom prst="rect"/>
                   </pic:spPr>
@@ -5971,32 +5983,7 @@
           <w:color w:val="556066"/>
           <w:sz w:val="18"/>
         </w:rPr>
-        <w:t>51 個自動化測試全部通過（含 100 局完整對局模擬）。最後一行 node build.mjs 之後 git status 沒有任何輸出，代表重新建置的 game.js、index.html 和提交的版本完全相同。</w:t>
-      </w:r>
-    </w:p>
-    <w:p>
-      <w:r>
-        <w:rPr>
-          <w:color w:val="556066"/>
-          <w:sz w:val="18"/>
-        </w:rPr>
-        <w:t>另外用 Playwright 開兩個瀏覽器，以真的 PeerJS 實際連線測試：選企業大廳 19 項、單機與多人分開 14 項、座位鎖定與接手 9 項、斷線恢復 9＋3 項、連線逾時 8 項、房間裡完整玩一季 6 項、多人競標與投資 20 項，全部通過。</w:t>
-      </w:r>
-    </w:p>
-    <w:p>
-      <w:r>
-        <w:rPr>
-          <w:b/>
-          <w:sz w:val="18"/>
-        </w:rPr>
-        <w:t>修正前後的錯誤紀錄：</w:t>
-      </w:r>
-      <w:r>
-        <w:rPr>
-          <w:color w:val="556066"/>
-          <w:sz w:val="18"/>
-        </w:rPr>
-        <w:t>連線逾時：修改前 8 項只過 2 項（畫面卡在「正在連線…」），修改後 8 項全過。房主斷線：修改前 9 項只過 2 項（房間被拆掉、訪客斷線），修改後 9 項全過。單機和多人分開後，實測發現房主按拉霸對局就消失：修正前的版本在「房間裡完整玩一季」只過 1 項，修正後 6 項全過。</w:t>
+        <w:t>用 Playwright 開多個瀏覽器，以真的 PeerJS 和本機配對伺服器實際連線。同一組情境在修改前只過 1 項（大廳留著「連線中…」、同名的人回來後按開始建立棋盤失敗、季數輸入 99 開不了局，所有裝置都卡住），修改後 16 項全過。另外 QR Code 14 項（用解碼器掃畫面上的 QR Code 再加入）、房間裡輪流擲骰 6 項也全部通過。</w:t>
       </w:r>
     </w:p>
     <w:p>
@@ -6373,7 +6360,7 @@
       <w:r>
         <w:drawing>
           <wp:inline xmlns:a="http://schemas.openxmlformats.org/drawingml/2006/main" xmlns:pic="http://schemas.openxmlformats.org/drawingml/2006/picture">
-            <wp:extent cx="5852160" cy="2908165"/>
+            <wp:extent cx="5852160" cy="3582955"/>
             <wp:docPr id="1135014478" name="Picture 1135014478"/>
             <wp:cNvGraphicFramePr>
               <a:graphicFrameLocks noChangeAspect="1"/>
@@ -6394,7 +6381,7 @@
                   <pic:spPr>
                     <a:xfrm>
                       <a:off x="0" y="0"/>
-                      <a:ext cx="5852160" cy="2908165"/>
+                      <a:ext cx="5852160" cy="3582955"/>
                     </a:xfrm>
                     <a:prstGeom prst="rect"/>
                   </pic:spPr>
@@ -6411,7 +6398,7 @@
           <w:color w:val="556066"/>
           <w:sz w:val="18"/>
         </w:rPr>
-        <w:t>feature/my-improvement 比 main 多 21 個 commit，包括多人連線、連線修正、選企業大廳、單機與多人分開，以及組員的企業投資與商機競標（1694e09）。</w:t>
+        <w:t>feature/my-improvement 比 main 多 27 個 commit。由下往上：第一版多人連線（房間代碼、連線逾時、房主斷線恢復、座位、選企業大廳、單機與多人分開）、組員的企業投資與商機競標（1694e09）、組員匯入的「併購派對」改版（5ef35c3，取代了原本的遊戲與房間程式），最上面兩個是這次的改良：a046cd6（QR Code 加入）和 6a3abf4（有人離開不會卡住）。</w:t>
       </w:r>
     </w:p>
     <w:p>
@@ -6563,7 +6550,7 @@
           <w:bCs/>
           <w:lang w:eastAsia="zh-TW"/>
         </w:rPr>
-        <w:t>請AI協助判斷 本次作業相對原始範本，增加了 約 60 % 的功能或改進</w:t>
+        <w:t>請AI協助判斷 本次作業相對原始範本，增加了 約 290 % 的功能或改進</w:t>
       </w:r>
     </w:p>
     <w:p>
@@ -6578,7 +6565,7 @@
           <w:rFonts w:eastAsia="新細明體" w:hint="eastAsia"/>
           <w:lang w:eastAsia="zh-TW"/>
         </w:rPr>
-        <w:t>AI 說明：以原始範本（main 分支 f66c429）為基準，不含自動產生的 game.js，程式與測試從約 150 KB 增加到約 240 KB（+60%），測試從 21 個增加到 51 個。原本的遊戲規則沒有改，增加的是：① 和單機分開的「多人連線」模式（房間代碼與邀請連結、WebRTC 點對點同步、進房自己選企業的大廳、座位鎖定與接手、連線逾時與房主斷線恢復、只看自己資料的淨資產排行），約 +35%；② 組員 Shuoting93 加入的企業投資卡與 14 種商機競標，約 +25%。綜合程式量與功能，判斷約增加 60%。</w:t>
+        <w:t>AI 說明：以原始範本（main 分支）為基準，不含自動產生的 game.js 和文件，程式從約 138 KB 增加到約 532 KB（約 3.9 倍，+290%），測試從 21 個增加到 83 個。增加的部分：① 第一版多人連線（房間代碼、選企業大廳、斷線處理等）和組員的企業投資與商機競標，約 +50%（程式到約 210 KB）；② 組員匯入的「併購派對」改版：新的 24 格棋盤、單顆骰子、道具與神話道具、十種企業技能、併購與子公司、三種模式、音效，以及新的連線大廳（net.js），約 +225%，同時取代了①大部分的程式；③ 這次的 QR Code 加入和離開／斷線處理，約 +8%。綜合程式量與功能，判斷約增加 290%。</w:t>
       </w:r>
     </w:p>
     <w:p>
@@ -6593,7 +6580,7 @@
           <w:rFonts w:eastAsia="新細明體" w:hint="eastAsia"/>
           <w:lang w:eastAsia="zh-TW"/>
         </w:rPr>
-        <w:t>附上AI說明的截圖：說明全文如上，由 Claude Code 依 git 統計整理，可用 git diff --stat main...feature/my-improvement 重現。</w:t>
+        <w:t>附上AI說明的截圖：說明全文如上，由 Claude Code 依 git 統計整理，可用 git ls-tree -r -l 比較各版本的檔案大小重現。</w:t>
       </w:r>
       <w:r>
         <w:rPr>
@@ -6793,17 +6780,17 @@
     </w:p>
     <w:p>
       <w:r>
-        <w:t>2. Codex 協助我讀懂原本的程式、寫 AGENTS.md，做出房間代碼和用代碼加入的第一版；後續再用 Claude Code 修正連線逾時和房主斷線，做出座位規則、選企業大廳、單機與多人分開，並寫測試、更新文件。需要我自己判斷的有：要不要加 TURN 中繼（需要把金鑰放在公開網頁，我決定不加）、座位規則（一人一台、選了就鎖定、全員入座才開始）、改成進房自己選企業、單機和多人要分開、畫面只顯示自己的資料和淨資產排行（和組員討論後決定）。很多問題是我用手機實測才發現的，例如同一支手機開兩個分頁連不上、手機存著舊局時進不了選企業畫面、按拉霸後對局消失，AI 的自動測試一開始都沒有抓到。</w:t>
-      </w:r>
-    </w:p>
-    <w:p>
-      <w:r>
-        <w:t>3. 下一步可以做：① 淘汰玩家的併吞規則（組員已經做了投資和商機競標，併吞還沒做）；② 玩家中途退出，讓他的公司改成無人經營，不用一直等人接手；③ 房主重新整理後能恢復房間和對局，目前房主一離開房間就結束了；④ 把瀏覽器自動測試放進 Repo，組員改程式後也能自己跑。原因是實際在課堂上玩時，最常遇到的是有人斷線或離開，這些都會讓整局卡住。</w:t>
-      </w:r>
-    </w:p>
-    <w:p>
-      <w:r>
-        <w:t>4. 自評約 60%：原作品只能在一台裝置輪流玩，現在多了每人一台手機的多人連線模式（含選企業大廳、斷線處理、只看自己資料的排行），加上組員做的企業投資與商機競標；原本的遊戲規則沒有改。程式量從約 150 KB 增加到約 240 KB，測試從 21 個增加到 51 個。</w:t>
+        <w:t>2. Codex 協助我讀懂原本的程式、寫 AGENTS.md，做出房間代碼和用代碼加入的第一版；後續用 Claude Code 修正連線逾時和房主斷線，做出座位規則、選企業大廳、單機與多人分開。組員把遊戲改版成「併購派對」後，連線改用組員的程式，我再用 Claude Code 加上 QR Code 加入，並修正有人離開後大廳卡住的問題，也寫了測試、更新文件。需要我自己判斷的有：要不要加 TURN 中繼（需要把金鑰放在公開網頁，我決定不加）、座位和選企業的規則、單機和多人要分開、畫面只顯示自己的資料和淨資產排行（和組員討論後決定）、直接採用組員的改版當今天展示的版本、接著先做 QR Code 加入。很多問題是我用手機實測才發現的，例如同一支手機開兩個分頁連不上、按拉霸後對局消失、有人退出後大廳卡住，AI 的自動測試一開始都沒有抓到。</w:t>
+      </w:r>
+    </w:p>
+    <w:p>
+      <w:r>
+        <w:t>3. 下一步可以做：① 對局中有人斷線時，輪到他整局會停住，可以讓房主替他跳過回合或代為操作；② 房主重新整理或手機鎖太久後能恢復房間和對局，目前房主一離開房間就結束；③ 修好組員匯入時就失敗的 11 個引擎測試，確認規則和測試一致；④ 把瀏覽器自動測試放進 Repo，組員改程式後也能自己跑。原因是實際在課堂上玩時，最常遇到的就是有人斷線或離開，這些都會讓整局卡住。</w:t>
+      </w:r>
+    </w:p>
+    <w:p>
+      <w:r>
+        <w:t>4. 自評約 290%：原作品只能在一台電腦輪流玩拉霸棋盤，現在是組員改版的「併購派對」（新棋盤、道具、企業技能、併購、三種模式、音效），加上每人一台手機的多人連線；我做的是多人連線（第一版房間系統後來被改版取代）和這次的 QR Code 加入、有人離開不會卡住。程式量從約 138 KB 增加到約 532 KB，測試從 21 個增加到 83 個。</w:t>
       </w:r>
     </w:p>
     <w:bookmarkEnd w:id="21"/>

</xml_diff>